<commit_message>
Parts 3 to 6: compliance round-1 fixes applied
</commit_message>
<xml_diff>
--- a/books/emergency-medicine/previews/ch03.docx
+++ b/books/emergency-medicine/previews/ch03.docx
@@ -585,7 +585,7 @@
         <w:pStyle w:val="BodyText"/>
       </w:pPr>
       <w:r>
-        <w:t xml:space="preserve">Figure 10 shows four simplified patterns; notice that the regular line differs from the chaotic one in spacing as well as in shape.</w:t>
+        <w:t xml:space="preserve">Figure 10 shows four of these patterns, simplified; notice that the regular line differs from the chaotic one in spacing as well as in shape.</w:t>
       </w:r>
     </w:p>
     <w:p>
@@ -667,7 +667,7 @@
         <w:pStyle w:val="TableCaption"/>
       </w:pPr>
       <w:r>
-        <w:t xml:space="preserve">Four patterns and what to do</w:t>
+        <w:t xml:space="preserve">Rhythm patterns and what to do</w:t>
       </w:r>
     </w:p>
     <w:tbl>
@@ -676,7 +676,7 @@
         <w:tblW w:type="pct" w:w="5000"/>
         <w:tblLook w:firstRow="1" w:lastRow="0" w:firstColumn="0" w:lastColumn="0" w:noHBand="0" w:noVBand="0" w:val="0020"/>
         <w:jc w:val="start"/>
-        <w:tblCaption w:val="Four patterns and what to do"/>
+        <w:tblCaption w:val="Rhythm patterns and what to do"/>
       </w:tblPr>
       <w:tblGrid>
         <w:gridCol w:w="1620"/>
@@ -926,7 +926,7 @@
         <w:t xml:space="preserve"> </w:t>
       </w:r>
       <w:r>
-        <w:t xml:space="preserve">A pulse check is a quick way to learn what the monitor cannot tell you. Feel the pulse at the wrist for a conscious patient. Note the rate, whether the beats are regular or irregular, and whether they feel strong or weak. Compare your count with the monitor if one is attached; if the monitor rate and your own count do not match, report the difference and trust your assessment of the patient. If you are a trained health care professional, check for a pulse at the neck of an unresponsive patient for no more than 10 seconds; if you are not sure you feel one, begin compressions. Entry 1.4 gives typical resting ranges.</w:t>
+        <w:t xml:space="preserve">Entry 1.4 described the pulse check. With a monitor attached, compare your count with the monitor’s rate; if the two do not match, report the difference and trust your assessment of the patient. If you are a trained health care professional, check for a pulse at the neck of an unresponsive patient for no more than 10 seconds; if you are not sure you feel one, begin compressions.</w:t>
       </w:r>
     </w:p>
     <w:p>
@@ -1855,7 +1855,7 @@
         <w:t xml:space="preserve"> </w:t>
       </w:r>
       <w:r>
-        <w:t xml:space="preserve">The first actions depend on the cause. For heavy bleeding, control it (Entry 4.2). For anaphylaxis, call for help and, where protocol allows, help with the patient’s own epinephrine auto-injector. Giving medicines is outside many roles; follow your scope and medical direction. For a suspected heart cause, call for help, keep the patient still and be ready to start CPR. For a suspected infection, call for help and report the signs, because early treatment is given by clinicians. In every case, keep the patient warm and flat unless breathing is difficult, and recheck often.</w:t>
+        <w:t xml:space="preserve">The first actions depend on the cause. For heavy bleeding, control it (Entry 4.2). For anaphylaxis, call for help and, where protocol allows, help with the patient’s own epinephrine auto-injector. Giving medicines is outside many roles; follow your scope and medical direction. For a suspected heart cause, call for help, keep the patient still and be ready to start CPR. For a suspected infection, call for help and report the signs, because early treatment is given by clinicians. In every case, keep the patient warm and recheck often. Lay the patient flat unless breathing is difficult or the cause is a heart problem or chest pain, when the most comfortable position is safer.</w:t>
       </w:r>
     </w:p>
     <w:p>
@@ -1899,7 +1899,7 @@
         <w:t xml:space="preserve"> </w:t>
       </w:r>
       <w:r>
-        <w:t xml:space="preserve">Call for help. Control any visible severe bleeding first, if your protocol directs it. Lay the patient flat unless they are struggling to breathe, keep them warm, and do not give food or drink. Give oxygen as your protocol directs. Giving medicines is outside many roles; follow your scope and medical direction. Recheck the vital signs at short intervals and write down the times. Entry 4.2 covers bleeding control, Entry 2.5 covers anaphylaxis, and Entry 5.4 covers sepsis.</w:t>
+        <w:t xml:space="preserve">Call for help. Control any visible severe bleeding first, if your protocol directs it. Lay the patient flat unless they are struggling to breathe or have chest pain, and in that case let them take the most comfortable position; keep them warm, and do not give food or drink. Give oxygen as your protocol directs. Giving medicines is outside many roles; follow your scope and medical direction. Recheck the vital signs at short intervals and write down the times. Entry 4.2 covers bleeding control, Entry 2.5 covers anaphylaxis, and Entry 5.4 covers sepsis.</w:t>
       </w:r>
     </w:p>
     <w:p>
@@ -1979,7 +1979,7 @@
         <w:pStyle w:val="BodyText"/>
       </w:pPr>
       <w:r>
-        <w:t xml:space="preserve">While she waited, she checked his breathing and his pulse and kept him calm. A few minutes later, Frank slumped sideways and stopped answering. Nadia lowered him to the floor, shouted his name, and saw that he was not breathing normally; he gave an occasional gasp. She told the colleague to say that the patient was not breathing, and began chest compressions at the center of the chest, pressing hard and counting aloud to keep the pace.</w:t>
+        <w:t xml:space="preserve">While she waited, she checked his breathing and his pulse and kept him calm. A few minutes later, Frank slumped sideways and stopped answering. Nadia lowered him to the floor, shouted his name, and saw that he was not breathing normally; he gave an occasional gasp. She called to another member to tell the dispatcher that Frank had collapsed and was not breathing normally, and began chest compressions at the center of the chest, pressing hard and counting aloud to keep the pace.</w:t>
       </w:r>
     </w:p>
     <w:p>

</xml_diff>